<commit_message>
Document PII anonymization in Support IT Intelligent user guide
Section 6 (Gouvernance, sécurité et confidentialité) now describes the
anonymization step added to the live n8n workflow: user name is never
sent to GPT-4o, and free-text PII is tokenized before the AI call and
restored only in the final user/technician-facing response.

Co-Authored-By: Claude Sonnet 5 <noreply@anthropic.com>
</commit_message>
<xml_diff>
--- a/docs/transferai-admin/151_Guide_Utilisateur_Support_IT_Intelligent_2026-07-08.docx
+++ b/docs/transferai-admin/151_Guide_Utilisateur_Support_IT_Intelligent_2026-07-08.docx
@@ -1517,6 +1517,23 @@
       </w:pPr>
       <w:r>
         <w:t xml:space="preserve">6. Gouvernance, sécurité et confidentialité</w:t>
+      </w:r>
+    </w:p>
+    <w:p>
+      <w:pPr>
+        <w:pStyle w:val="ListParagraph"/>
+        <w:numPr>
+          <w:ilvl w:val="0"/>
+          <w:numId w:val="3"/>
+        </w:numPr>
+        <w:spacing w:after="100"/>
+      </w:pPr>
+      <w:r>
+        <w:rPr>
+          <w:sz w:val="21"/>
+          <w:szCs w:val="21"/>
+        </w:rPr>
+        <w:t xml:space="preserve">Anonymisation avant tout appel à l'IA : le nom du demandeur n'est jamais transmis au modèle GPT-4o, qui ne reçoit que son département. Les données sensibles saisies en texte libre dans le ticket (email, téléphone, nom d'un tiers, etc.) sont automatiquement détectées et remplacées par des jetons avant l'analyse, puis restaurées uniquement dans la réponse finale adressée au demandeur et au technicien.</w:t>
       </w:r>
     </w:p>
     <w:p>

</xml_diff>